<commit_message>
MiniProject - Cau F - Kiem tra Authentication / Middleware
</commit_message>
<xml_diff>
--- a/Lap11_capture.docx
+++ b/Lap11_capture.docx
@@ -144,8 +144,68 @@
       <w:r>
         <w:t>s ProductController thành công</w:t>
       </w:r>
+      <w:r>
+        <w:br/>
+      </w:r>
+      <w:r>
+        <w:br/>
+      </w:r>
+      <w:r>
+        <w:rPr>
+          <w:noProof/>
+          <w:lang w:eastAsia="vi-VN"/>
+        </w:rPr>
+        <w:lastRenderedPageBreak/>
+        <w:drawing>
+          <wp:inline distT="0" distB="0" distL="0" distR="0" wp14:anchorId="344D6D54" wp14:editId="3D790CE7">
+            <wp:extent cx="5731510" cy="3086100"/>
+            <wp:effectExtent l="0" t="0" r="2540" b="0"/>
+            <wp:docPr id="3" name="Picture 3"/>
+            <wp:cNvGraphicFramePr>
+              <a:graphicFrameLocks xmlns:a="http://schemas.openxmlformats.org/drawingml/2006/main" noChangeAspect="1"/>
+            </wp:cNvGraphicFramePr>
+            <a:graphic xmlns:a="http://schemas.openxmlformats.org/drawingml/2006/main">
+              <a:graphicData uri="http://schemas.openxmlformats.org/drawingml/2006/picture">
+                <pic:pic xmlns:pic="http://schemas.openxmlformats.org/drawingml/2006/picture">
+                  <pic:nvPicPr>
+                    <pic:cNvPr id="1" name=""/>
+                    <pic:cNvPicPr/>
+                  </pic:nvPicPr>
+                  <pic:blipFill>
+                    <a:blip r:embed="rId6"/>
+                    <a:stretch>
+                      <a:fillRect/>
+                    </a:stretch>
+                  </pic:blipFill>
+                  <pic:spPr>
+                    <a:xfrm>
+                      <a:off x="0" y="0"/>
+                      <a:ext cx="5731510" cy="3086100"/>
+                    </a:xfrm>
+                    <a:prstGeom prst="rect">
+                      <a:avLst/>
+                    </a:prstGeom>
+                  </pic:spPr>
+                </pic:pic>
+              </a:graphicData>
+            </a:graphic>
+          </wp:inline>
+        </w:drawing>
+      </w:r>
+      <w:r>
+        <w:br/>
+      </w:r>
+      <w:r>
+        <w:br/>
+      </w:r>
       <w:bookmarkStart w:id="0" w:name="_GoBack"/>
       <w:bookmarkEnd w:id="0"/>
+      <w:r>
+        <w:t>Hình 3: Kiểm tra cấu hình Namespace và Autoload hoạt động ổn định khi truy cậ</w:t>
+      </w:r>
+      <w:r>
+        <w:t>p qua area=admin</w:t>
+      </w:r>
     </w:p>
     <w:sectPr>
       <w:pgSz w:w="11906" w:h="16838"/>

</xml_diff>

<commit_message>
MiniProject - Cau H - Kiem tra toan bo CRUD
</commit_message>
<xml_diff>
--- a/Lap11_capture.docx
+++ b/Lap11_capture.docx
@@ -198,14 +198,258 @@
       <w:r>
         <w:br/>
       </w:r>
+      <w:r>
+        <w:t>Hình 3: Kiểm tra cấu hình Namespace và Autoload hoạt động ổn định khi truy cậ</w:t>
+      </w:r>
+      <w:r>
+        <w:t>p qua area=admin</w:t>
+      </w:r>
+      <w:r>
+        <w:br/>
+      </w:r>
+      <w:r>
+        <w:br/>
+      </w:r>
+      <w:r>
+        <w:rPr>
+          <w:noProof/>
+          <w:lang w:eastAsia="vi-VN"/>
+        </w:rPr>
+        <w:drawing>
+          <wp:inline distT="0" distB="0" distL="0" distR="0" wp14:anchorId="3BA9AEB8" wp14:editId="08A7718A">
+            <wp:extent cx="5731510" cy="3084195"/>
+            <wp:effectExtent l="0" t="0" r="2540" b="1905"/>
+            <wp:docPr id="4" name="Picture 4"/>
+            <wp:cNvGraphicFramePr>
+              <a:graphicFrameLocks xmlns:a="http://schemas.openxmlformats.org/drawingml/2006/main" noChangeAspect="1"/>
+            </wp:cNvGraphicFramePr>
+            <a:graphic xmlns:a="http://schemas.openxmlformats.org/drawingml/2006/main">
+              <a:graphicData uri="http://schemas.openxmlformats.org/drawingml/2006/picture">
+                <pic:pic xmlns:pic="http://schemas.openxmlformats.org/drawingml/2006/picture">
+                  <pic:nvPicPr>
+                    <pic:cNvPr id="1" name=""/>
+                    <pic:cNvPicPr/>
+                  </pic:nvPicPr>
+                  <pic:blipFill>
+                    <a:blip r:embed="rId7"/>
+                    <a:stretch>
+                      <a:fillRect/>
+                    </a:stretch>
+                  </pic:blipFill>
+                  <pic:spPr>
+                    <a:xfrm>
+                      <a:off x="0" y="0"/>
+                      <a:ext cx="5731510" cy="3084195"/>
+                    </a:xfrm>
+                    <a:prstGeom prst="rect">
+                      <a:avLst/>
+                    </a:prstGeom>
+                  </pic:spPr>
+                </pic:pic>
+              </a:graphicData>
+            </a:graphic>
+          </wp:inline>
+        </w:drawing>
+      </w:r>
+      <w:r>
+        <w:br/>
+      </w:r>
+      <w:r>
+        <w:br/>
+      </w:r>
+      <w:r>
+        <w:t>Hình 4: Kiểm tra nhập sai tài khoản/mật khẩu, hệ thống hiển thị thông báo lỗi chính xác.</w:t>
+      </w:r>
+      <w:r>
+        <w:br/>
+      </w:r>
+      <w:r>
+        <w:br/>
+      </w:r>
+      <w:r>
+        <w:rPr>
+          <w:noProof/>
+          <w:lang w:eastAsia="vi-VN"/>
+        </w:rPr>
+        <w:lastRenderedPageBreak/>
+        <w:drawing>
+          <wp:inline distT="0" distB="0" distL="0" distR="0" wp14:anchorId="2B641796" wp14:editId="455BCCF6">
+            <wp:extent cx="5731510" cy="3138170"/>
+            <wp:effectExtent l="0" t="0" r="2540" b="5080"/>
+            <wp:docPr id="5" name="Picture 5"/>
+            <wp:cNvGraphicFramePr>
+              <a:graphicFrameLocks xmlns:a="http://schemas.openxmlformats.org/drawingml/2006/main" noChangeAspect="1"/>
+            </wp:cNvGraphicFramePr>
+            <a:graphic xmlns:a="http://schemas.openxmlformats.org/drawingml/2006/main">
+              <a:graphicData uri="http://schemas.openxmlformats.org/drawingml/2006/picture">
+                <pic:pic xmlns:pic="http://schemas.openxmlformats.org/drawingml/2006/picture">
+                  <pic:nvPicPr>
+                    <pic:cNvPr id="1" name=""/>
+                    <pic:cNvPicPr/>
+                  </pic:nvPicPr>
+                  <pic:blipFill>
+                    <a:blip r:embed="rId8"/>
+                    <a:stretch>
+                      <a:fillRect/>
+                    </a:stretch>
+                  </pic:blipFill>
+                  <pic:spPr>
+                    <a:xfrm>
+                      <a:off x="0" y="0"/>
+                      <a:ext cx="5731510" cy="3138170"/>
+                    </a:xfrm>
+                    <a:prstGeom prst="rect">
+                      <a:avLst/>
+                    </a:prstGeom>
+                  </pic:spPr>
+                </pic:pic>
+              </a:graphicData>
+            </a:graphic>
+          </wp:inline>
+        </w:drawing>
+      </w:r>
+      <w:r>
+        <w:br/>
+      </w:r>
+      <w:r>
+        <w:br/>
+      </w:r>
+      <w:r>
+        <w:br/>
+      </w:r>
+      <w:r>
+        <w:t>Hình 5: Đăng nhập thành công, hệ thống điều hướng vào trang quả</w:t>
+      </w:r>
+      <w:r>
+        <w:t>n lý bên trong</w:t>
+      </w:r>
+      <w:r>
+        <w:br/>
+      </w:r>
+      <w:r>
+        <w:br/>
+      </w:r>
+      <w:r>
+        <w:rPr>
+          <w:noProof/>
+          <w:lang w:eastAsia="vi-VN"/>
+        </w:rPr>
+        <w:drawing>
+          <wp:inline distT="0" distB="0" distL="0" distR="0" wp14:anchorId="0B8DD362" wp14:editId="138912E6">
+            <wp:extent cx="5731510" cy="3220720"/>
+            <wp:effectExtent l="0" t="0" r="2540" b="0"/>
+            <wp:docPr id="6" name="Picture 6"/>
+            <wp:cNvGraphicFramePr>
+              <a:graphicFrameLocks xmlns:a="http://schemas.openxmlformats.org/drawingml/2006/main" noChangeAspect="1"/>
+            </wp:cNvGraphicFramePr>
+            <a:graphic xmlns:a="http://schemas.openxmlformats.org/drawingml/2006/main">
+              <a:graphicData uri="http://schemas.openxmlformats.org/drawingml/2006/picture">
+                <pic:pic xmlns:pic="http://schemas.openxmlformats.org/drawingml/2006/picture">
+                  <pic:nvPicPr>
+                    <pic:cNvPr id="1" name=""/>
+                    <pic:cNvPicPr/>
+                  </pic:nvPicPr>
+                  <pic:blipFill>
+                    <a:blip r:embed="rId9"/>
+                    <a:stretch>
+                      <a:fillRect/>
+                    </a:stretch>
+                  </pic:blipFill>
+                  <pic:spPr>
+                    <a:xfrm>
+                      <a:off x="0" y="0"/>
+                      <a:ext cx="5731510" cy="3220720"/>
+                    </a:xfrm>
+                    <a:prstGeom prst="rect">
+                      <a:avLst/>
+                    </a:prstGeom>
+                  </pic:spPr>
+                </pic:pic>
+              </a:graphicData>
+            </a:graphic>
+          </wp:inline>
+        </w:drawing>
+      </w:r>
+      <w:r>
+        <w:br/>
+      </w:r>
+      <w:r>
+        <w:br/>
+      </w:r>
+      <w:r>
+        <w:t>Hình 6: Kiểm tra chức năng Đăng xuất thành công, hệ thống tự động hủy Session và chuyển về</w:t>
+      </w:r>
+      <w:r>
+        <w:t xml:space="preserve"> trang Login</w:t>
+      </w:r>
+      <w:r>
+        <w:br/>
+      </w:r>
+      <w:r>
+        <w:br/>
+      </w:r>
+      <w:r>
+        <w:rPr>
+          <w:noProof/>
+          <w:lang w:eastAsia="vi-VN"/>
+        </w:rPr>
+        <w:lastRenderedPageBreak/>
+        <w:drawing>
+          <wp:inline distT="0" distB="0" distL="0" distR="0" wp14:anchorId="3CB16A03" wp14:editId="40E70A7D">
+            <wp:extent cx="5731510" cy="3534410"/>
+            <wp:effectExtent l="0" t="0" r="2540" b="8890"/>
+            <wp:docPr id="7" name="Picture 7"/>
+            <wp:cNvGraphicFramePr>
+              <a:graphicFrameLocks xmlns:a="http://schemas.openxmlformats.org/drawingml/2006/main" noChangeAspect="1"/>
+            </wp:cNvGraphicFramePr>
+            <a:graphic xmlns:a="http://schemas.openxmlformats.org/drawingml/2006/main">
+              <a:graphicData uri="http://schemas.openxmlformats.org/drawingml/2006/picture">
+                <pic:pic xmlns:pic="http://schemas.openxmlformats.org/drawingml/2006/picture">
+                  <pic:nvPicPr>
+                    <pic:cNvPr id="1" name=""/>
+                    <pic:cNvPicPr/>
+                  </pic:nvPicPr>
+                  <pic:blipFill>
+                    <a:blip r:embed="rId10"/>
+                    <a:stretch>
+                      <a:fillRect/>
+                    </a:stretch>
+                  </pic:blipFill>
+                  <pic:spPr>
+                    <a:xfrm>
+                      <a:off x="0" y="0"/>
+                      <a:ext cx="5731510" cy="3534410"/>
+                    </a:xfrm>
+                    <a:prstGeom prst="rect">
+                      <a:avLst/>
+                    </a:prstGeom>
+                  </pic:spPr>
+                </pic:pic>
+              </a:graphicData>
+            </a:graphic>
+          </wp:inline>
+        </w:drawing>
+      </w:r>
+      <w:r>
+        <w:br/>
+      </w:r>
+      <w:r>
+        <w:br/>
+      </w:r>
+      <w:r>
+        <w:t>Hình 7: Kiểm tra AuthMiddleware, cố tình truy cập trực tiếp trang quản lý khi chưa đăng nhập sẽ bị đẩy về</w:t>
+      </w:r>
+      <w:r>
+        <w:t xml:space="preserve"> trang Login</w:t>
+      </w:r>
+      <w:r>
+        <w:br/>
+      </w:r>
+      <w:r>
+        <w:br/>
+      </w:r>
       <w:bookmarkStart w:id="0" w:name="_GoBack"/>
       <w:bookmarkEnd w:id="0"/>
-      <w:r>
-        <w:t>Hình 3: Kiểm tra cấu hình Namespace và Autoload hoạt động ổn định khi truy cậ</w:t>
-      </w:r>
-      <w:r>
-        <w:t>p qua area=admin</w:t>
-      </w:r>
     </w:p>
     <w:sectPr>
       <w:pgSz w:w="11906" w:h="16838"/>

</xml_diff>